<commit_message>
(docs): user stories almost finished, but still don´t have every acceptance criteria
</commit_message>
<xml_diff>
--- a/docs/UserStories/USER STORIES-AgroMetal-ERP.docx
+++ b/docs/UserStories/USER STORIES-AgroMetal-ERP.docx
@@ -4,12 +4,21 @@
   <w:body>
     <w:p>
       <w:pPr>
-        <w:rPr>
-          <w:lang w:val="pt-PT"/>
-        </w:rPr>
-      </w:pPr>
-      <w:r>
-        <w:rPr>
+        <w:jc w:val="center"/>
+        <w:rPr>
+          <w:b/>
+          <w:bCs/>
+          <w:sz w:val="32"/>
+          <w:szCs w:val="32"/>
+          <w:lang w:val="pt-PT"/>
+        </w:rPr>
+      </w:pPr>
+      <w:r>
+        <w:rPr>
+          <w:b/>
+          <w:bCs/>
+          <w:sz w:val="32"/>
+          <w:szCs w:val="32"/>
           <w:lang w:val="pt-PT"/>
         </w:rPr>
         <w:t>USER STORIES E ACCEPTANCE CRITERIA</w:t>
@@ -17,6 +26,7 @@
     </w:p>
     <w:p>
       <w:pPr>
+        <w:pStyle w:val="Heading1"/>
         <w:rPr>
           <w:lang w:val="pt-PT"/>
         </w:rPr>
@@ -36,6 +46,20 @@
       </w:pPr>
       <w:r>
         <w:rPr>
+          <w:b/>
+          <w:bCs/>
+          <w:lang w:val="pt-PT"/>
+        </w:rPr>
+        <w:t>US-01</w:t>
+      </w:r>
+      <w:r>
+        <w:rPr>
+          <w:lang w:val="pt-PT"/>
+        </w:rPr>
+        <w:t xml:space="preserve"> - </w:t>
+      </w:r>
+      <w:r>
+        <w:rPr>
           <w:lang w:val="pt-PT"/>
         </w:rPr>
         <w:t>Como diretor geral quero ver um dashboard geral da empresa para tomar decisões rápidas.</w:t>
@@ -43,26 +67,319 @@
     </w:p>
     <w:p>
       <w:pPr>
-        <w:rPr>
-          <w:lang w:val="pt-PT"/>
-        </w:rPr>
-      </w:pPr>
+        <w:pStyle w:val="ListParagraph"/>
+        <w:numPr>
+          <w:ilvl w:val="0"/>
+          <w:numId w:val="1"/>
+        </w:numPr>
+        <w:rPr>
+          <w:lang w:val="pt-PT"/>
+        </w:rPr>
+      </w:pPr>
+      <w:r>
+        <w:rPr>
+          <w:lang w:val="pt-PT"/>
+        </w:rPr>
+        <w:t>CRITÉRIO DE ACEITAÇÃO (ACCEPTANCE CRITERIA)</w:t>
+      </w:r>
+    </w:p>
+    <w:p>
+      <w:pPr>
+        <w:pStyle w:val="ListParagraph"/>
+        <w:numPr>
+          <w:ilvl w:val="1"/>
+          <w:numId w:val="1"/>
+        </w:numPr>
+        <w:rPr>
+          <w:lang w:val="pt-PT"/>
+        </w:rPr>
+      </w:pPr>
+      <w:r>
+        <w:rPr>
+          <w:lang w:val="pt-PT"/>
+        </w:rPr>
+        <w:t>Dado que estou autenticado com a regra admin</w:t>
+      </w:r>
+    </w:p>
+    <w:p>
+      <w:pPr>
+        <w:pStyle w:val="ListParagraph"/>
+        <w:numPr>
+          <w:ilvl w:val="1"/>
+          <w:numId w:val="1"/>
+        </w:numPr>
+        <w:rPr>
+          <w:lang w:val="pt-PT"/>
+        </w:rPr>
+      </w:pPr>
+      <w:r>
+        <w:rPr>
+          <w:lang w:val="pt-PT"/>
+        </w:rPr>
+        <w:t>Quanto eu ir para o dashboard da empresa eu veja o resumo geral de tudo: vendas, compras, produção</w:t>
+      </w:r>
+      <w:r>
+        <w:rPr>
+          <w:lang w:val="pt-PT"/>
+        </w:rPr>
+        <w:t xml:space="preserve">, </w:t>
+      </w:r>
+      <w:r>
+        <w:rPr>
+          <w:lang w:val="pt-PT"/>
+        </w:rPr>
+        <w:t>recursos humanos</w:t>
+      </w:r>
+    </w:p>
+    <w:p>
+      <w:pPr>
+        <w:pStyle w:val="ListParagraph"/>
+        <w:ind w:left="1724" w:firstLine="0"/>
+        <w:rPr>
+          <w:lang w:val="pt-PT"/>
+        </w:rPr>
+      </w:pPr>
+      <w:r>
+        <w:rPr>
+          <w:lang w:val="pt-PT"/>
+        </w:rPr>
+        <w:t xml:space="preserve"> </w:t>
+      </w:r>
+    </w:p>
+    <w:p>
+      <w:pPr>
+        <w:rPr>
+          <w:lang w:val="pt-PT"/>
+        </w:rPr>
+      </w:pPr>
+      <w:r>
+        <w:rPr>
+          <w:b/>
+          <w:bCs/>
+          <w:lang w:val="pt-PT"/>
+        </w:rPr>
+        <w:t>US-0</w:t>
+      </w:r>
+      <w:r>
+        <w:rPr>
+          <w:b/>
+          <w:bCs/>
+          <w:lang w:val="pt-PT"/>
+        </w:rPr>
+        <w:t>2</w:t>
+      </w:r>
+      <w:r>
+        <w:rPr>
+          <w:lang w:val="pt-PT"/>
+        </w:rPr>
+        <w:t xml:space="preserve"> - </w:t>
+      </w:r>
       <w:r>
         <w:rPr>
           <w:lang w:val="pt-PT"/>
         </w:rPr>
         <w:t>Como diretor geral quero ver lucro e prejuizo mensais, para avaliar o desempenho</w:t>
       </w:r>
-    </w:p>
-    <w:p>
-      <w:pPr>
-        <w:rPr>
-          <w:lang w:val="pt-PT"/>
-        </w:rPr>
-      </w:pPr>
-    </w:p>
-    <w:p>
-      <w:pPr>
+      <w:r>
+        <w:rPr>
+          <w:lang w:val="pt-PT"/>
+        </w:rPr>
+        <w:t>.</w:t>
+      </w:r>
+    </w:p>
+    <w:p>
+      <w:pPr>
+        <w:pStyle w:val="ListParagraph"/>
+        <w:numPr>
+          <w:ilvl w:val="0"/>
+          <w:numId w:val="1"/>
+        </w:numPr>
+        <w:rPr>
+          <w:lang w:val="pt-PT"/>
+        </w:rPr>
+      </w:pPr>
+      <w:r>
+        <w:rPr>
+          <w:lang w:val="pt-PT"/>
+        </w:rPr>
+        <w:t>CRITÉRIO DE ACEITAÇÃO (ACCEPTANCE CRITERIA)</w:t>
+      </w:r>
+    </w:p>
+    <w:p>
+      <w:pPr>
+        <w:pStyle w:val="ListParagraph"/>
+        <w:numPr>
+          <w:ilvl w:val="1"/>
+          <w:numId w:val="1"/>
+        </w:numPr>
+        <w:rPr>
+          <w:lang w:val="pt-PT"/>
+        </w:rPr>
+      </w:pPr>
+      <w:r>
+        <w:rPr>
+          <w:lang w:val="pt-PT"/>
+        </w:rPr>
+        <w:t>Dado que estou autenticado com a regra de admin</w:t>
+      </w:r>
+    </w:p>
+    <w:p>
+      <w:pPr>
+        <w:pStyle w:val="ListParagraph"/>
+        <w:numPr>
+          <w:ilvl w:val="1"/>
+          <w:numId w:val="1"/>
+        </w:numPr>
+        <w:rPr>
+          <w:lang w:val="pt-PT"/>
+        </w:rPr>
+      </w:pPr>
+      <w:r>
+        <w:rPr>
+          <w:lang w:val="pt-PT"/>
+        </w:rPr>
+        <w:t>Posso ver um grafico de transações financeiras mensais, trimestrais, semetrais e anuais</w:t>
+      </w:r>
+      <w:r>
+        <w:rPr>
+          <w:lang w:val="pt-PT"/>
+        </w:rPr>
+        <w:t>.</w:t>
+      </w:r>
+    </w:p>
+    <w:p>
+      <w:pPr>
+        <w:pStyle w:val="ListParagraph"/>
+        <w:numPr>
+          <w:ilvl w:val="1"/>
+          <w:numId w:val="1"/>
+        </w:numPr>
+        <w:rPr>
+          <w:lang w:val="pt-PT"/>
+        </w:rPr>
+      </w:pPr>
+      <w:r>
+        <w:rPr>
+          <w:lang w:val="pt-PT"/>
+        </w:rPr>
+        <w:t>Devo ser capaz de ver os historico de todos os prejuizos, despesas, dividas, direitos e lucros em cada estação(mensal, trimestrais, semetrais e anuais) que a empresa adquiriu</w:t>
+      </w:r>
+    </w:p>
+    <w:p>
+      <w:pPr>
+        <w:rPr>
+          <w:lang w:val="pt-PT"/>
+        </w:rPr>
+      </w:pPr>
+    </w:p>
+    <w:p>
+      <w:r>
+        <w:rPr>
+          <w:b/>
+          <w:bCs/>
+          <w:lang w:val="pt-PT"/>
+        </w:rPr>
+        <w:t>US-0</w:t>
+      </w:r>
+      <w:r>
+        <w:rPr>
+          <w:b/>
+          <w:bCs/>
+          <w:lang w:val="pt-PT"/>
+        </w:rPr>
+        <w:t>3</w:t>
+      </w:r>
+      <w:r>
+        <w:rPr>
+          <w:lang w:val="pt-PT"/>
+        </w:rPr>
+        <w:t xml:space="preserve"> - </w:t>
+      </w:r>
+      <w:r>
+        <w:t xml:space="preserve">Como </w:t>
+      </w:r>
+      <w:r>
+        <w:t>director geral</w:t>
+      </w:r>
+      <w:r>
+        <w:t>, quero definir o que cada tipo de utilizador pode ver e fazer no sistema, para garantir que dados sensíveis só são acessíveis a quem tem permissão.</w:t>
+      </w:r>
+    </w:p>
+    <w:p>
+      <w:pPr>
+        <w:pStyle w:val="ListParagraph"/>
+        <w:numPr>
+          <w:ilvl w:val="0"/>
+          <w:numId w:val="1"/>
+        </w:numPr>
+        <w:rPr>
+          <w:lang w:val="pt-PT"/>
+        </w:rPr>
+      </w:pPr>
+      <w:r>
+        <w:rPr>
+          <w:lang w:val="pt-PT"/>
+        </w:rPr>
+        <w:t>CRITÉRIO DE ACEITAÇÃO (ACCEPTANCE CRITERIA)</w:t>
+      </w:r>
+    </w:p>
+    <w:p>
+      <w:pPr>
+        <w:pStyle w:val="ListParagraph"/>
+        <w:numPr>
+          <w:ilvl w:val="1"/>
+          <w:numId w:val="1"/>
+        </w:numPr>
+        <w:rPr>
+          <w:lang w:val="pt-PT"/>
+        </w:rPr>
+      </w:pPr>
+      <w:r>
+        <w:rPr>
+          <w:lang w:val="pt-PT"/>
+        </w:rPr>
+        <w:t>DADO QUE existe um utilizador com role "sales"</w:t>
+      </w:r>
+    </w:p>
+    <w:p>
+      <w:pPr>
+        <w:pStyle w:val="ListParagraph"/>
+        <w:numPr>
+          <w:ilvl w:val="1"/>
+          <w:numId w:val="1"/>
+        </w:numPr>
+        <w:rPr>
+          <w:lang w:val="pt-PT"/>
+        </w:rPr>
+      </w:pPr>
+      <w:r>
+        <w:rPr>
+          <w:lang w:val="pt-PT"/>
+        </w:rPr>
+        <w:t>QUANDO tenta aceder a /hr/employees ou /financial/transactions</w:t>
+      </w:r>
+    </w:p>
+    <w:p>
+      <w:pPr>
+        <w:pStyle w:val="ListParagraph"/>
+        <w:numPr>
+          <w:ilvl w:val="1"/>
+          <w:numId w:val="1"/>
+        </w:numPr>
+        <w:rPr>
+          <w:lang w:val="pt-PT"/>
+        </w:rPr>
+      </w:pPr>
+      <w:r>
+        <w:rPr>
+          <w:lang w:val="pt-PT"/>
+        </w:rPr>
+        <w:t>ENTÃO recebe erro 403 Forbidden e o acesso é negado</w:t>
+      </w:r>
+    </w:p>
+    <w:p>
+      <w:pPr>
+        <w:pStyle w:val="Heading1"/>
         <w:rPr>
           <w:lang w:val="pt-PT"/>
         </w:rPr>
@@ -82,6 +399,28 @@
       </w:pPr>
       <w:r>
         <w:rPr>
+          <w:b/>
+          <w:bCs/>
+          <w:lang w:val="pt-PT"/>
+        </w:rPr>
+        <w:t>US-0</w:t>
+      </w:r>
+      <w:r>
+        <w:rPr>
+          <w:b/>
+          <w:bCs/>
+          <w:lang w:val="pt-PT"/>
+        </w:rPr>
+        <w:t>4</w:t>
+      </w:r>
+      <w:r>
+        <w:rPr>
+          <w:lang w:val="pt-PT"/>
+        </w:rPr>
+        <w:t xml:space="preserve"> - </w:t>
+      </w:r>
+      <w:r>
+        <w:rPr>
           <w:lang w:val="pt-PT"/>
         </w:rPr>
         <w:t xml:space="preserve">Como director financeiro , quero registrar despesas e receitas para controlar o fluxo de caixa </w:t>
@@ -89,52 +428,447 @@
     </w:p>
     <w:p>
       <w:pPr>
-        <w:rPr>
-          <w:lang w:val="pt-PT"/>
-        </w:rPr>
-      </w:pPr>
-      <w:r>
-        <w:rPr>
-          <w:lang w:val="pt-PT"/>
-        </w:rPr>
-        <w:t>Como direcot financeiro quero ver relatório, para evitar prejuizos</w:t>
-      </w:r>
-    </w:p>
-    <w:p>
-      <w:pPr>
-        <w:rPr>
-          <w:lang w:val="pt-PT"/>
-        </w:rPr>
-      </w:pPr>
-      <w:r>
-        <w:rPr>
-          <w:lang w:val="pt-PT"/>
-        </w:rPr>
-        <w:t>Como diretor financeiro quero ver os saldo atual para evitar decisões erradas e conhecer a saude da empresa</w:t>
-      </w:r>
-    </w:p>
-    <w:p>
-      <w:pPr>
-        <w:rPr>
-          <w:lang w:val="pt-PT"/>
-        </w:rPr>
-      </w:pPr>
-      <w:r>
-        <w:rPr>
-          <w:lang w:val="pt-PT"/>
-        </w:rPr>
-        <w:t>Como diretor financeiro quero ver o o historico de todas as transações realizada para poder ter uma visão geral das obrigrações, direitos e patrimonio actual da empresa</w:t>
-      </w:r>
-    </w:p>
-    <w:p>
-      <w:pPr>
-        <w:rPr>
-          <w:lang w:val="pt-PT"/>
-        </w:rPr>
-      </w:pPr>
-    </w:p>
-    <w:p>
-      <w:pPr>
+        <w:pStyle w:val="ListParagraph"/>
+        <w:numPr>
+          <w:ilvl w:val="0"/>
+          <w:numId w:val="1"/>
+        </w:numPr>
+        <w:rPr>
+          <w:lang w:val="pt-PT"/>
+        </w:rPr>
+      </w:pPr>
+      <w:r>
+        <w:rPr>
+          <w:lang w:val="pt-PT"/>
+        </w:rPr>
+        <w:t>CRITÉRIO DE ACEITAÇÃO (ACCEPTANCE CRITERIA)</w:t>
+      </w:r>
+    </w:p>
+    <w:p>
+      <w:pPr>
+        <w:pStyle w:val="ListParagraph"/>
+        <w:numPr>
+          <w:ilvl w:val="1"/>
+          <w:numId w:val="1"/>
+        </w:numPr>
+        <w:rPr>
+          <w:lang w:val="pt-PT"/>
+        </w:rPr>
+      </w:pPr>
+      <w:r>
+        <w:rPr>
+          <w:lang w:val="pt-PT"/>
+        </w:rPr>
+        <w:t>Dado que estou logado com a regra financeiro ou admin</w:t>
+      </w:r>
+    </w:p>
+    <w:p>
+      <w:pPr>
+        <w:pStyle w:val="ListParagraph"/>
+        <w:numPr>
+          <w:ilvl w:val="1"/>
+          <w:numId w:val="1"/>
+        </w:numPr>
+        <w:rPr>
+          <w:lang w:val="pt-PT"/>
+        </w:rPr>
+      </w:pPr>
+      <w:r>
+        <w:rPr>
+          <w:lang w:val="pt-PT"/>
+        </w:rPr>
+        <w:t>Quando houver</w:t>
+      </w:r>
+      <w:r>
+        <w:rPr>
+          <w:lang w:val="pt-PT"/>
+        </w:rPr>
+        <w:t xml:space="preserve">s despesas e receirtas de um dados periodo </w:t>
+      </w:r>
+    </w:p>
+    <w:p>
+      <w:pPr>
+        <w:pStyle w:val="ListParagraph"/>
+        <w:numPr>
+          <w:ilvl w:val="1"/>
+          <w:numId w:val="1"/>
+        </w:numPr>
+        <w:rPr>
+          <w:lang w:val="pt-PT"/>
+        </w:rPr>
+      </w:pPr>
+      <w:r>
+        <w:rPr>
+          <w:lang w:val="pt-PT"/>
+        </w:rPr>
+        <w:t xml:space="preserve">Então posso registra-lá </w:t>
+      </w:r>
+      <w:r>
+        <w:rPr>
+          <w:lang w:val="pt-PT"/>
+        </w:rPr>
+        <w:t>e verificar a saúde financeira da empresa para apuração dos resultados</w:t>
+      </w:r>
+    </w:p>
+    <w:p>
+      <w:pPr>
+        <w:pStyle w:val="ListParagraph"/>
+        <w:ind w:left="1004" w:firstLine="0"/>
+        <w:rPr>
+          <w:lang w:val="pt-PT"/>
+        </w:rPr>
+      </w:pPr>
+    </w:p>
+    <w:p>
+      <w:pPr>
+        <w:rPr>
+          <w:lang w:val="pt-PT"/>
+        </w:rPr>
+      </w:pPr>
+      <w:r>
+        <w:rPr>
+          <w:b/>
+          <w:bCs/>
+          <w:lang w:val="pt-PT"/>
+        </w:rPr>
+        <w:t>US-0</w:t>
+      </w:r>
+      <w:r>
+        <w:rPr>
+          <w:b/>
+          <w:bCs/>
+          <w:lang w:val="pt-PT"/>
+        </w:rPr>
+        <w:t>5</w:t>
+      </w:r>
+      <w:r>
+        <w:rPr>
+          <w:lang w:val="pt-PT"/>
+        </w:rPr>
+        <w:t xml:space="preserve"> - </w:t>
+      </w:r>
+      <w:r>
+        <w:rPr>
+          <w:lang w:val="pt-PT"/>
+        </w:rPr>
+        <w:t>Como direc</w:t>
+      </w:r>
+      <w:r>
+        <w:rPr>
+          <w:lang w:val="pt-PT"/>
+        </w:rPr>
+        <w:t>tor</w:t>
+      </w:r>
+      <w:r>
+        <w:rPr>
+          <w:lang w:val="pt-PT"/>
+        </w:rPr>
+        <w:t xml:space="preserve"> financeiro quero ver relatório</w:t>
+      </w:r>
+      <w:r>
+        <w:rPr>
+          <w:lang w:val="pt-PT"/>
+        </w:rPr>
+        <w:t xml:space="preserve"> das transações realizadas em um dado periodo(mensal,semestra,trimestral  e anual)</w:t>
+      </w:r>
+      <w:r>
+        <w:rPr>
+          <w:lang w:val="pt-PT"/>
+        </w:rPr>
+        <w:t>, para evitar prejuizos</w:t>
+      </w:r>
+    </w:p>
+    <w:p>
+      <w:pPr>
+        <w:pStyle w:val="ListParagraph"/>
+        <w:numPr>
+          <w:ilvl w:val="0"/>
+          <w:numId w:val="1"/>
+        </w:numPr>
+        <w:rPr>
+          <w:lang w:val="pt-PT"/>
+        </w:rPr>
+      </w:pPr>
+      <w:r>
+        <w:rPr>
+          <w:lang w:val="pt-PT"/>
+        </w:rPr>
+        <w:t>CRITÉRIO DE ACEITAÇÃO (ACCEPTANCE CRITERIA)</w:t>
+      </w:r>
+    </w:p>
+    <w:p>
+      <w:pPr>
+        <w:pStyle w:val="ListParagraph"/>
+        <w:ind w:left="1004" w:firstLine="0"/>
+        <w:rPr>
+          <w:lang w:val="pt-PT"/>
+        </w:rPr>
+      </w:pPr>
+    </w:p>
+    <w:p>
+      <w:pPr>
+        <w:rPr>
+          <w:lang w:val="pt-PT"/>
+        </w:rPr>
+      </w:pPr>
+      <w:r>
+        <w:rPr>
+          <w:b/>
+          <w:bCs/>
+          <w:lang w:val="pt-PT"/>
+        </w:rPr>
+        <w:t>US-0</w:t>
+      </w:r>
+      <w:r>
+        <w:rPr>
+          <w:b/>
+          <w:bCs/>
+          <w:lang w:val="pt-PT"/>
+        </w:rPr>
+        <w:t>6</w:t>
+      </w:r>
+      <w:r>
+        <w:rPr>
+          <w:lang w:val="pt-PT"/>
+        </w:rPr>
+        <w:t xml:space="preserve"> - </w:t>
+      </w:r>
+      <w:r>
+        <w:rPr>
+          <w:lang w:val="pt-PT"/>
+        </w:rPr>
+        <w:t>Como dire</w:t>
+      </w:r>
+      <w:r>
+        <w:rPr>
+          <w:lang w:val="pt-PT"/>
+        </w:rPr>
+        <w:t>c</w:t>
+      </w:r>
+      <w:r>
+        <w:rPr>
+          <w:lang w:val="pt-PT"/>
+        </w:rPr>
+        <w:t xml:space="preserve">tor financeiro quero ver os saldo atual para evitar decisões </w:t>
+      </w:r>
+      <w:r>
+        <w:rPr>
+          <w:lang w:val="pt-PT"/>
+        </w:rPr>
+        <w:t>erradas e conhecer a saude da empresa</w:t>
+      </w:r>
+    </w:p>
+    <w:p>
+      <w:pPr>
+        <w:pStyle w:val="ListParagraph"/>
+        <w:numPr>
+          <w:ilvl w:val="0"/>
+          <w:numId w:val="1"/>
+        </w:numPr>
+        <w:rPr>
+          <w:lang w:val="pt-PT"/>
+        </w:rPr>
+      </w:pPr>
+      <w:r>
+        <w:rPr>
+          <w:lang w:val="pt-PT"/>
+        </w:rPr>
+        <w:t>CRITÉRIO DE ACEITAÇÃO (ACCEPTANCE CRITERIA)</w:t>
+      </w:r>
+    </w:p>
+    <w:p>
+      <w:pPr>
+        <w:rPr>
+          <w:lang w:val="pt-PT"/>
+        </w:rPr>
+      </w:pPr>
+      <w:r>
+        <w:rPr>
+          <w:b/>
+          <w:bCs/>
+          <w:lang w:val="pt-PT"/>
+        </w:rPr>
+        <w:t>US-0</w:t>
+      </w:r>
+      <w:r>
+        <w:rPr>
+          <w:b/>
+          <w:bCs/>
+          <w:lang w:val="pt-PT"/>
+        </w:rPr>
+        <w:t>7</w:t>
+      </w:r>
+      <w:r>
+        <w:rPr>
+          <w:lang w:val="pt-PT"/>
+        </w:rPr>
+        <w:t xml:space="preserve"> - </w:t>
+      </w:r>
+      <w:r>
+        <w:rPr>
+          <w:lang w:val="pt-PT"/>
+        </w:rPr>
+        <w:t>Como dire</w:t>
+      </w:r>
+      <w:r>
+        <w:rPr>
+          <w:lang w:val="pt-PT"/>
+        </w:rPr>
+        <w:t>c</w:t>
+      </w:r>
+      <w:r>
+        <w:rPr>
+          <w:lang w:val="pt-PT"/>
+        </w:rPr>
+        <w:t>tor financeiro quero ver o  historico de todas as transações</w:t>
+      </w:r>
+      <w:r>
+        <w:rPr>
+          <w:lang w:val="pt-PT"/>
+        </w:rPr>
+        <w:t xml:space="preserve"> </w:t>
+      </w:r>
+      <w:r>
+        <w:rPr>
+          <w:lang w:val="pt-PT"/>
+        </w:rPr>
+        <w:t>realizada para poder ter uma visão geral das obrigrações, direitos e patrimonio actual da empresa</w:t>
+      </w:r>
+    </w:p>
+    <w:p>
+      <w:pPr>
+        <w:pStyle w:val="ListParagraph"/>
+        <w:numPr>
+          <w:ilvl w:val="0"/>
+          <w:numId w:val="1"/>
+        </w:numPr>
+        <w:rPr>
+          <w:lang w:val="pt-PT"/>
+        </w:rPr>
+      </w:pPr>
+      <w:r>
+        <w:rPr>
+          <w:lang w:val="pt-PT"/>
+        </w:rPr>
+        <w:t>CRITÉRIO DE ACEITAÇÃO (ACCEPTANCE CRITERIA)</w:t>
+      </w:r>
+    </w:p>
+    <w:p>
+      <w:pPr>
+        <w:rPr>
+          <w:lang w:val="pt-PT"/>
+        </w:rPr>
+      </w:pPr>
+    </w:p>
+    <w:p>
+      <w:r>
+        <w:rPr>
+          <w:b/>
+          <w:bCs/>
+          <w:lang w:val="pt-PT"/>
+        </w:rPr>
+        <w:t>US-0</w:t>
+      </w:r>
+      <w:r>
+        <w:rPr>
+          <w:b/>
+          <w:bCs/>
+          <w:lang w:val="pt-PT"/>
+        </w:rPr>
+        <w:t>8</w:t>
+      </w:r>
+      <w:r>
+        <w:rPr>
+          <w:lang w:val="pt-PT"/>
+        </w:rPr>
+        <w:t xml:space="preserve"> - </w:t>
+      </w:r>
+      <w:r>
+        <w:t>Como director financeiro, quero ver o fluxo de caixa actual em tempo real, para tomar decisões de pagamento sem esperar o fim do mês.</w:t>
+      </w:r>
+    </w:p>
+    <w:p>
+      <w:pPr>
+        <w:pStyle w:val="ListParagraph"/>
+        <w:numPr>
+          <w:ilvl w:val="0"/>
+          <w:numId w:val="1"/>
+        </w:numPr>
+        <w:rPr>
+          <w:lang w:val="pt-PT"/>
+        </w:rPr>
+      </w:pPr>
+      <w:r>
+        <w:rPr>
+          <w:lang w:val="pt-PT"/>
+        </w:rPr>
+        <w:t>CRITÉRIO DE ACEITAÇÃO (ACCEPTANCE CRITERIA)</w:t>
+      </w:r>
+    </w:p>
+    <w:p>
+      <w:pPr>
+        <w:pStyle w:val="ListParagraph"/>
+        <w:numPr>
+          <w:ilvl w:val="1"/>
+          <w:numId w:val="1"/>
+        </w:numPr>
+        <w:rPr>
+          <w:lang w:val="pt-PT"/>
+        </w:rPr>
+      </w:pPr>
+      <w:r>
+        <w:rPr>
+          <w:lang w:val="pt-PT"/>
+        </w:rPr>
+        <w:t>Dado que estou autenticado com role accountant ou admin</w:t>
+      </w:r>
+    </w:p>
+    <w:p>
+      <w:pPr>
+        <w:pStyle w:val="ListParagraph"/>
+        <w:numPr>
+          <w:ilvl w:val="1"/>
+          <w:numId w:val="1"/>
+        </w:numPr>
+        <w:rPr>
+          <w:lang w:val="pt-PT"/>
+        </w:rPr>
+      </w:pPr>
+      <w:r>
+        <w:rPr>
+          <w:lang w:val="pt-PT"/>
+        </w:rPr>
+        <w:t>Quando acedo ao dashboard financeiro</w:t>
+      </w:r>
+    </w:p>
+    <w:p>
+      <w:pPr>
+        <w:pStyle w:val="ListParagraph"/>
+        <w:numPr>
+          <w:ilvl w:val="1"/>
+          <w:numId w:val="1"/>
+        </w:numPr>
+        <w:rPr>
+          <w:lang w:val="pt-PT"/>
+        </w:rPr>
+      </w:pPr>
+      <w:r>
+        <w:rPr>
+          <w:lang w:val="pt-PT"/>
+        </w:rPr>
+        <w:t>Então vejo o saldo actual, entradas e saídas do mês, e comparação com o mês anterior — actualizados em tempo real</w:t>
+      </w:r>
+    </w:p>
+    <w:p>
+      <w:pPr>
+        <w:rPr>
+          <w:lang w:val="pt-PT"/>
+        </w:rPr>
+      </w:pPr>
+    </w:p>
+    <w:p>
+      <w:pPr>
+        <w:pStyle w:val="Heading1"/>
         <w:rPr>
           <w:lang w:val="pt-PT"/>
         </w:rPr>
@@ -166,43 +900,294 @@
       </w:pPr>
       <w:r>
         <w:rPr>
+          <w:b/>
+          <w:bCs/>
+          <w:lang w:val="pt-PT"/>
+        </w:rPr>
+        <w:t>US-0</w:t>
+      </w:r>
+      <w:r>
+        <w:rPr>
+          <w:b/>
+          <w:bCs/>
+          <w:lang w:val="pt-PT"/>
+        </w:rPr>
+        <w:t>9</w:t>
+      </w:r>
+      <w:r>
+        <w:rPr>
+          <w:lang w:val="pt-PT"/>
+        </w:rPr>
+        <w:t xml:space="preserve"> - </w:t>
+      </w:r>
+      <w:r>
+        <w:rPr>
           <w:lang w:val="pt-PT"/>
         </w:rPr>
         <w:t>Como responsavel  do armazém quero monitorar o estoque para evitar rupturas</w:t>
       </w:r>
-    </w:p>
-    <w:p>
-      <w:pPr>
-        <w:rPr>
-          <w:lang w:val="pt-PT"/>
-        </w:rPr>
-      </w:pPr>
+      <w:r>
+        <w:rPr>
+          <w:lang w:val="pt-PT"/>
+        </w:rPr>
+        <w:t>.</w:t>
+      </w:r>
+    </w:p>
+    <w:p>
+      <w:pPr>
+        <w:pStyle w:val="ListParagraph"/>
+        <w:numPr>
+          <w:ilvl w:val="0"/>
+          <w:numId w:val="1"/>
+        </w:numPr>
+        <w:rPr>
+          <w:lang w:val="pt-PT"/>
+        </w:rPr>
+      </w:pPr>
+      <w:r>
+        <w:rPr>
+          <w:lang w:val="pt-PT"/>
+        </w:rPr>
+        <w:t>CRITÉRIO DE ACEITAÇÃO (ACCEPTANCE CRITERIA)</w:t>
+      </w:r>
+    </w:p>
+    <w:p>
+      <w:pPr>
+        <w:rPr>
+          <w:lang w:val="pt-PT"/>
+        </w:rPr>
+      </w:pPr>
+    </w:p>
+    <w:p>
+      <w:pPr>
+        <w:rPr>
+          <w:lang w:val="pt-PT"/>
+        </w:rPr>
+      </w:pPr>
+      <w:r>
+        <w:rPr>
+          <w:b/>
+          <w:bCs/>
+          <w:lang w:val="pt-PT"/>
+        </w:rPr>
+        <w:t>US-</w:t>
+      </w:r>
+      <w:r>
+        <w:rPr>
+          <w:b/>
+          <w:bCs/>
+          <w:lang w:val="pt-PT"/>
+        </w:rPr>
+        <w:t>10</w:t>
+      </w:r>
+      <w:r>
+        <w:rPr>
+          <w:lang w:val="pt-PT"/>
+        </w:rPr>
+        <w:t xml:space="preserve"> - </w:t>
+      </w:r>
       <w:r>
         <w:rPr>
           <w:lang w:val="pt-PT"/>
         </w:rPr>
         <w:t>Como responsável do armazém quero receber alertas de estoque baixo, para repor produtos</w:t>
       </w:r>
-    </w:p>
-    <w:p>
-      <w:pPr>
-        <w:rPr>
-          <w:lang w:val="pt-PT"/>
-        </w:rPr>
-      </w:pPr>
+      <w:r>
+        <w:rPr>
+          <w:lang w:val="pt-PT"/>
+        </w:rPr>
+        <w:t xml:space="preserve"> e assim evitar paragens de produção.</w:t>
+      </w:r>
+    </w:p>
+    <w:p>
+      <w:pPr>
+        <w:pStyle w:val="ListParagraph"/>
+        <w:numPr>
+          <w:ilvl w:val="0"/>
+          <w:numId w:val="1"/>
+        </w:numPr>
+        <w:rPr>
+          <w:lang w:val="pt-PT"/>
+        </w:rPr>
+      </w:pPr>
+      <w:r>
+        <w:rPr>
+          <w:lang w:val="pt-PT"/>
+        </w:rPr>
+        <w:t>CRITÉRIO DE ACEITAÇÃO (ACCEPTANCE CRITERIA)</w:t>
+      </w:r>
+    </w:p>
+    <w:p>
+      <w:pPr>
+        <w:pStyle w:val="ListParagraph"/>
+        <w:numPr>
+          <w:ilvl w:val="1"/>
+          <w:numId w:val="1"/>
+        </w:numPr>
+        <w:rPr>
+          <w:lang w:val="pt-PT"/>
+        </w:rPr>
+      </w:pPr>
+      <w:r>
+        <w:rPr>
+          <w:lang w:val="pt-PT"/>
+        </w:rPr>
+        <w:t>Dado que o stock_minimo de "chapa a36 3mm" é 100 unidades</w:t>
+      </w:r>
+    </w:p>
+    <w:p>
+      <w:pPr>
+        <w:pStyle w:val="ListParagraph"/>
+        <w:numPr>
+          <w:ilvl w:val="1"/>
+          <w:numId w:val="1"/>
+        </w:numPr>
+        <w:rPr>
+          <w:lang w:val="pt-PT"/>
+        </w:rPr>
+      </w:pPr>
+      <w:r>
+        <w:rPr>
+          <w:lang w:val="pt-PT"/>
+        </w:rPr>
+        <w:t>Quando o stock actual fica abaixo de 100</w:t>
+      </w:r>
+    </w:p>
+    <w:p>
+      <w:pPr>
+        <w:pStyle w:val="ListParagraph"/>
+        <w:numPr>
+          <w:ilvl w:val="1"/>
+          <w:numId w:val="1"/>
+        </w:numPr>
+        <w:rPr>
+          <w:lang w:val="pt-PT"/>
+        </w:rPr>
+      </w:pPr>
+      <w:r>
+        <w:rPr>
+          <w:lang w:val="pt-PT"/>
+        </w:rPr>
+        <w:t>Então o produto aparece com estado "stock crítico" no dashboard e um alerta é gerado</w:t>
+      </w:r>
+    </w:p>
+    <w:p>
+      <w:pPr>
+        <w:rPr>
+          <w:lang w:val="pt-PT"/>
+        </w:rPr>
+      </w:pPr>
+    </w:p>
+    <w:p>
+      <w:pPr>
+        <w:rPr>
+          <w:lang w:val="pt-PT"/>
+        </w:rPr>
+      </w:pPr>
+      <w:r>
+        <w:rPr>
+          <w:b/>
+          <w:bCs/>
+          <w:lang w:val="pt-PT"/>
+        </w:rPr>
+        <w:t>US-</w:t>
+      </w:r>
+      <w:r>
+        <w:rPr>
+          <w:b/>
+          <w:bCs/>
+          <w:lang w:val="pt-PT"/>
+        </w:rPr>
+        <w:t>1</w:t>
+      </w:r>
+      <w:r>
+        <w:rPr>
+          <w:b/>
+          <w:bCs/>
+          <w:lang w:val="pt-PT"/>
+        </w:rPr>
+        <w:t>1</w:t>
+      </w:r>
+      <w:r>
+        <w:rPr>
+          <w:lang w:val="pt-PT"/>
+        </w:rPr>
+        <w:t xml:space="preserve"> - </w:t>
+      </w:r>
       <w:r>
         <w:rPr>
           <w:lang w:val="pt-PT"/>
         </w:rPr>
         <w:t>Como responsável do armazém quero receber notificações antes de qualquer movimento no estoque para eu poder controlar o fluxo de entrada e saida do estoque</w:t>
       </w:r>
-    </w:p>
-    <w:p>
-      <w:pPr>
-        <w:rPr>
-          <w:lang w:val="pt-PT"/>
-        </w:rPr>
-      </w:pPr>
+      <w:r>
+        <w:rPr>
+          <w:lang w:val="pt-PT"/>
+        </w:rPr>
+        <w:t>.</w:t>
+      </w:r>
+    </w:p>
+    <w:p>
+      <w:pPr>
+        <w:pStyle w:val="ListParagraph"/>
+        <w:numPr>
+          <w:ilvl w:val="0"/>
+          <w:numId w:val="1"/>
+        </w:numPr>
+        <w:rPr>
+          <w:lang w:val="pt-PT"/>
+        </w:rPr>
+      </w:pPr>
+      <w:r>
+        <w:rPr>
+          <w:lang w:val="pt-PT"/>
+        </w:rPr>
+        <w:t>CRITÉRIO DE ACEITAÇÃO (ACCEPTANCE CRITERIA)</w:t>
+      </w:r>
+    </w:p>
+    <w:p>
+      <w:pPr>
+        <w:rPr>
+          <w:lang w:val="pt-PT"/>
+        </w:rPr>
+      </w:pPr>
+    </w:p>
+    <w:p>
+      <w:pPr>
+        <w:rPr>
+          <w:lang w:val="pt-PT"/>
+        </w:rPr>
+      </w:pPr>
+      <w:r>
+        <w:rPr>
+          <w:b/>
+          <w:bCs/>
+          <w:lang w:val="pt-PT"/>
+        </w:rPr>
+        <w:t>US-</w:t>
+      </w:r>
+      <w:r>
+        <w:rPr>
+          <w:b/>
+          <w:bCs/>
+          <w:lang w:val="pt-PT"/>
+        </w:rPr>
+        <w:t>1</w:t>
+      </w:r>
+      <w:r>
+        <w:rPr>
+          <w:b/>
+          <w:bCs/>
+          <w:lang w:val="pt-PT"/>
+        </w:rPr>
+        <w:t>2</w:t>
+      </w:r>
+      <w:r>
+        <w:rPr>
+          <w:lang w:val="pt-PT"/>
+        </w:rPr>
+        <w:t xml:space="preserve"> - </w:t>
+      </w:r>
       <w:r>
         <w:rPr>
           <w:lang w:val="pt-PT"/>
@@ -212,6 +1197,216 @@
     </w:p>
     <w:p>
       <w:pPr>
+        <w:pStyle w:val="ListParagraph"/>
+        <w:numPr>
+          <w:ilvl w:val="0"/>
+          <w:numId w:val="1"/>
+        </w:numPr>
+        <w:rPr>
+          <w:lang w:val="pt-PT"/>
+        </w:rPr>
+      </w:pPr>
+      <w:r>
+        <w:rPr>
+          <w:lang w:val="pt-PT"/>
+        </w:rPr>
+        <w:t>CRITÉRIO DE ACEITAÇÃO (ACCEPTANCE CRITERIA)</w:t>
+      </w:r>
+    </w:p>
+    <w:p>
+      <w:pPr>
+        <w:rPr>
+          <w:lang w:val="pt-PT"/>
+        </w:rPr>
+      </w:pPr>
+    </w:p>
+    <w:p>
+      <w:r>
+        <w:rPr>
+          <w:b/>
+          <w:bCs/>
+          <w:lang w:val="pt-PT"/>
+        </w:rPr>
+        <w:t>US-</w:t>
+      </w:r>
+      <w:r>
+        <w:rPr>
+          <w:b/>
+          <w:bCs/>
+          <w:lang w:val="pt-PT"/>
+        </w:rPr>
+        <w:t>1</w:t>
+      </w:r>
+      <w:r>
+        <w:rPr>
+          <w:b/>
+          <w:bCs/>
+          <w:lang w:val="pt-PT"/>
+        </w:rPr>
+        <w:t>3</w:t>
+      </w:r>
+      <w:r>
+        <w:rPr>
+          <w:lang w:val="pt-PT"/>
+        </w:rPr>
+        <w:t xml:space="preserve"> - </w:t>
+      </w:r>
+      <w:r>
+        <w:t>Como gestor de armazém, quero registar a entrada de matéria-prima com quantidade e fornecedor, para manter o inventário actualizado em tempo real.</w:t>
+      </w:r>
+    </w:p>
+    <w:p>
+      <w:pPr>
+        <w:pStyle w:val="ListParagraph"/>
+        <w:numPr>
+          <w:ilvl w:val="0"/>
+          <w:numId w:val="1"/>
+        </w:numPr>
+        <w:rPr>
+          <w:lang w:val="pt-PT"/>
+        </w:rPr>
+      </w:pPr>
+      <w:r>
+        <w:rPr>
+          <w:lang w:val="pt-PT"/>
+        </w:rPr>
+        <w:t>CRITÉRIO DE ACEITAÇÃO (ACCEPTANCE CRITERIA)</w:t>
+      </w:r>
+    </w:p>
+    <w:p>
+      <w:pPr>
+        <w:pStyle w:val="ListParagraph"/>
+        <w:numPr>
+          <w:ilvl w:val="1"/>
+          <w:numId w:val="1"/>
+        </w:numPr>
+        <w:rPr>
+          <w:lang w:val="pt-PT"/>
+        </w:rPr>
+      </w:pPr>
+      <w:r>
+        <w:rPr>
+          <w:lang w:val="pt-PT"/>
+        </w:rPr>
+        <w:t>Dado que estou autenticado com role warehouse ou admin</w:t>
+      </w:r>
+    </w:p>
+    <w:p>
+      <w:pPr>
+        <w:pStyle w:val="ListParagraph"/>
+        <w:numPr>
+          <w:ilvl w:val="1"/>
+          <w:numId w:val="1"/>
+        </w:numPr>
+        <w:rPr>
+          <w:lang w:val="pt-PT"/>
+        </w:rPr>
+      </w:pPr>
+      <w:r>
+        <w:rPr>
+          <w:lang w:val="pt-PT"/>
+        </w:rPr>
+        <w:t>Quando submeto o formulário de entrada com produto, quantidade e fornecedor</w:t>
+      </w:r>
+    </w:p>
+    <w:p>
+      <w:pPr>
+        <w:pStyle w:val="ListParagraph"/>
+        <w:numPr>
+          <w:ilvl w:val="1"/>
+          <w:numId w:val="1"/>
+        </w:numPr>
+        <w:rPr>
+          <w:lang w:val="pt-PT"/>
+        </w:rPr>
+      </w:pPr>
+      <w:r>
+        <w:rPr>
+          <w:lang w:val="pt-PT"/>
+        </w:rPr>
+        <w:t>Então o stock do produto é incrementado e uma movimentação é registada com timestamp</w:t>
+      </w:r>
+    </w:p>
+    <w:p>
+      <w:pPr>
+        <w:rPr>
+          <w:lang w:val="pt-PT"/>
+        </w:rPr>
+      </w:pPr>
+    </w:p>
+    <w:p>
+      <w:pPr>
+        <w:rPr>
+          <w:lang w:val="pt-PT"/>
+        </w:rPr>
+      </w:pPr>
+      <w:r>
+        <w:rPr>
+          <w:b/>
+          <w:bCs/>
+          <w:lang w:val="pt-PT"/>
+        </w:rPr>
+        <w:t>US-</w:t>
+      </w:r>
+      <w:r>
+        <w:rPr>
+          <w:b/>
+          <w:bCs/>
+          <w:lang w:val="pt-PT"/>
+        </w:rPr>
+        <w:t>1</w:t>
+      </w:r>
+      <w:r>
+        <w:rPr>
+          <w:b/>
+          <w:bCs/>
+          <w:lang w:val="pt-PT"/>
+        </w:rPr>
+        <w:t>4</w:t>
+      </w:r>
+      <w:r>
+        <w:rPr>
+          <w:b/>
+          <w:bCs/>
+          <w:lang w:val="pt-PT"/>
+        </w:rPr>
+        <w:t xml:space="preserve"> </w:t>
+      </w:r>
+      <w:r>
+        <w:rPr>
+          <w:lang w:val="pt-PT"/>
+        </w:rPr>
+        <w:t>– Como gestor de armazém quero poder agendar compras de materia prima para garantir o aprovisionamento em tempo oportuno.</w:t>
+      </w:r>
+    </w:p>
+    <w:p>
+      <w:pPr>
+        <w:pStyle w:val="ListParagraph"/>
+        <w:numPr>
+          <w:ilvl w:val="0"/>
+          <w:numId w:val="1"/>
+        </w:numPr>
+        <w:rPr>
+          <w:lang w:val="pt-PT"/>
+        </w:rPr>
+      </w:pPr>
+      <w:r>
+        <w:rPr>
+          <w:lang w:val="pt-PT"/>
+        </w:rPr>
+        <w:t>CRITÉRIO DE ACEITAÇÃO (ACCEPTANCE CRITERIA)</w:t>
+      </w:r>
+    </w:p>
+    <w:p>
+      <w:pPr>
+        <w:rPr>
+          <w:lang w:val="pt-PT"/>
+        </w:rPr>
+      </w:pPr>
+    </w:p>
+    <w:p>
+      <w:pPr>
+        <w:pStyle w:val="Heading1"/>
         <w:rPr>
           <w:lang w:val="pt-PT"/>
         </w:rPr>
@@ -231,42 +1426,353 @@
       </w:pPr>
       <w:r>
         <w:rPr>
+          <w:b/>
+          <w:bCs/>
+          <w:lang w:val="pt-PT"/>
+        </w:rPr>
+        <w:t>US-</w:t>
+      </w:r>
+      <w:r>
+        <w:rPr>
+          <w:b/>
+          <w:bCs/>
+          <w:lang w:val="pt-PT"/>
+        </w:rPr>
+        <w:t>1</w:t>
+      </w:r>
+      <w:r>
+        <w:rPr>
+          <w:b/>
+          <w:bCs/>
+          <w:lang w:val="pt-PT"/>
+        </w:rPr>
+        <w:t>5</w:t>
+      </w:r>
+      <w:r>
+        <w:rPr>
+          <w:b/>
+          <w:bCs/>
+          <w:lang w:val="pt-PT"/>
+        </w:rPr>
+        <w:t xml:space="preserve"> - </w:t>
+      </w:r>
+      <w:r>
+        <w:rPr>
           <w:lang w:val="pt-PT"/>
         </w:rPr>
         <w:t>Como director de RH quero cadastrar e gerenciar funcionario, para manter organização</w:t>
       </w:r>
-    </w:p>
-    <w:p>
-      <w:pPr>
-        <w:rPr>
-          <w:lang w:val="pt-PT"/>
-        </w:rPr>
-      </w:pPr>
-      <w:r>
-        <w:rPr>
-          <w:lang w:val="pt-PT"/>
-        </w:rPr>
-        <w:t>Como diretor de RH, quero acompanhar desemplenho dos funcionario , para melhorar a equipe</w:t>
-      </w:r>
-    </w:p>
-    <w:p>
-      <w:pPr>
-        <w:rPr>
-          <w:lang w:val="pt-PT"/>
-        </w:rPr>
-      </w:pPr>
-    </w:p>
-    <w:p>
-      <w:pPr>
-        <w:rPr>
-          <w:lang w:val="pt-PT"/>
-        </w:rPr>
-      </w:pPr>
-      <w:r>
-        <w:rPr>
-          <w:lang w:val="pt-PT"/>
-        </w:rPr>
+      <w:r>
+        <w:rPr>
+          <w:lang w:val="pt-PT"/>
+        </w:rPr>
+        <w:t>.</w:t>
+      </w:r>
+    </w:p>
+    <w:p>
+      <w:pPr>
+        <w:pStyle w:val="ListParagraph"/>
+        <w:numPr>
+          <w:ilvl w:val="0"/>
+          <w:numId w:val="1"/>
+        </w:numPr>
+        <w:rPr>
+          <w:lang w:val="pt-PT"/>
+        </w:rPr>
+      </w:pPr>
+      <w:r>
+        <w:rPr>
+          <w:lang w:val="pt-PT"/>
+        </w:rPr>
+        <w:t>CRITÉRIO DE ACEITAÇÃO (ACCEPTANCE CRITERIA)</w:t>
+      </w:r>
+    </w:p>
+    <w:p>
+      <w:pPr>
+        <w:rPr>
+          <w:lang w:val="pt-PT"/>
+        </w:rPr>
+      </w:pPr>
+    </w:p>
+    <w:p>
+      <w:pPr>
+        <w:ind w:firstLine="0"/>
+        <w:rPr>
+          <w:lang w:val="pt-PT"/>
+        </w:rPr>
+      </w:pPr>
+      <w:r>
+        <w:rPr>
+          <w:b/>
+          <w:bCs/>
+          <w:lang w:val="pt-PT"/>
+        </w:rPr>
+        <w:t>US-</w:t>
+      </w:r>
+      <w:r>
+        <w:rPr>
+          <w:b/>
+          <w:bCs/>
+          <w:lang w:val="pt-PT"/>
+        </w:rPr>
+        <w:t>1</w:t>
+      </w:r>
+      <w:r>
+        <w:rPr>
+          <w:b/>
+          <w:bCs/>
+          <w:lang w:val="pt-PT"/>
+        </w:rPr>
+        <w:t xml:space="preserve">6 </w:t>
+      </w:r>
+      <w:r>
+        <w:rPr>
+          <w:b/>
+          <w:bCs/>
+          <w:lang w:val="pt-PT"/>
+        </w:rPr>
+        <w:t xml:space="preserve">- </w:t>
+      </w:r>
+      <w:r>
+        <w:rPr>
+          <w:lang w:val="pt-PT"/>
+        </w:rPr>
+        <w:t>Como diretor de RH, quero acompanhar desemplenho dos funcionario, para melhorar a</w:t>
+      </w:r>
+      <w:r>
+        <w:rPr>
+          <w:lang w:val="pt-PT"/>
+        </w:rPr>
+        <w:t xml:space="preserve"> </w:t>
+      </w:r>
+      <w:r>
+        <w:rPr>
+          <w:lang w:val="pt-PT"/>
+        </w:rPr>
+        <w:t>equipe</w:t>
+      </w:r>
+      <w:r>
+        <w:rPr>
+          <w:lang w:val="pt-PT"/>
+        </w:rPr>
+        <w:t>.</w:t>
+      </w:r>
+    </w:p>
+    <w:p>
+      <w:pPr>
+        <w:pStyle w:val="ListParagraph"/>
+        <w:numPr>
+          <w:ilvl w:val="0"/>
+          <w:numId w:val="1"/>
+        </w:numPr>
+        <w:rPr>
+          <w:lang w:val="pt-PT"/>
+        </w:rPr>
+      </w:pPr>
+      <w:r>
+        <w:rPr>
+          <w:lang w:val="pt-PT"/>
+        </w:rPr>
+        <w:t>CRITÉRIO DE ACEITAÇÃO (ACCEPTANCE CRITERIA)</w:t>
+      </w:r>
+    </w:p>
+    <w:p>
+      <w:pPr>
+        <w:ind w:firstLine="0"/>
+      </w:pPr>
+      <w:r>
         <w:lastRenderedPageBreak/>
+        <w:br/>
+      </w:r>
+      <w:r>
+        <w:rPr>
+          <w:b/>
+          <w:bCs/>
+          <w:lang w:val="pt-PT"/>
+        </w:rPr>
+        <w:t>US-</w:t>
+      </w:r>
+      <w:r>
+        <w:rPr>
+          <w:b/>
+          <w:bCs/>
+          <w:lang w:val="pt-PT"/>
+        </w:rPr>
+        <w:t>1</w:t>
+      </w:r>
+      <w:r>
+        <w:rPr>
+          <w:b/>
+          <w:bCs/>
+          <w:lang w:val="pt-PT"/>
+        </w:rPr>
+        <w:t>7</w:t>
+      </w:r>
+      <w:r>
+        <w:rPr>
+          <w:b/>
+          <w:bCs/>
+          <w:lang w:val="pt-PT"/>
+        </w:rPr>
+        <w:t xml:space="preserve"> </w:t>
+      </w:r>
+      <w:r>
+        <w:rPr>
+          <w:b/>
+          <w:bCs/>
+          <w:lang w:val="pt-PT"/>
+        </w:rPr>
+        <w:t xml:space="preserve">- </w:t>
+      </w:r>
+      <w:r>
+        <w:t>Como director de RH, quero processar os salários mensais de todos os funcionários de uma vez, para reduzir o tempo de 4 dias para menos de 4 horas.</w:t>
+      </w:r>
+    </w:p>
+    <w:p>
+      <w:pPr>
+        <w:pStyle w:val="ListParagraph"/>
+        <w:numPr>
+          <w:ilvl w:val="0"/>
+          <w:numId w:val="1"/>
+        </w:numPr>
+        <w:rPr>
+          <w:lang w:val="pt-PT"/>
+        </w:rPr>
+      </w:pPr>
+      <w:r>
+        <w:rPr>
+          <w:lang w:val="pt-PT"/>
+        </w:rPr>
+        <w:t>CRITÉRIO DE ACEITAÇÃO (ACCEPTANCE CRITERIA)</w:t>
+      </w:r>
+    </w:p>
+    <w:p>
+      <w:pPr>
+        <w:pStyle w:val="ListParagraph"/>
+        <w:numPr>
+          <w:ilvl w:val="1"/>
+          <w:numId w:val="1"/>
+        </w:numPr>
+        <w:rPr>
+          <w:lang w:val="pt-PT"/>
+        </w:rPr>
+      </w:pPr>
+      <w:r>
+        <w:rPr>
+          <w:lang w:val="pt-PT"/>
+        </w:rPr>
+        <w:t>Dado que é o fim do mês e os registos de presença estão completos</w:t>
+      </w:r>
+    </w:p>
+    <w:p>
+      <w:pPr>
+        <w:pStyle w:val="ListParagraph"/>
+        <w:numPr>
+          <w:ilvl w:val="1"/>
+          <w:numId w:val="1"/>
+        </w:numPr>
+        <w:rPr>
+          <w:lang w:val="pt-PT"/>
+        </w:rPr>
+      </w:pPr>
+      <w:r>
+        <w:rPr>
+          <w:lang w:val="pt-PT"/>
+        </w:rPr>
+        <w:t>Quando executo o processamento mensal para o mês de referência</w:t>
+      </w:r>
+    </w:p>
+    <w:p>
+      <w:pPr>
+        <w:pStyle w:val="ListParagraph"/>
+        <w:numPr>
+          <w:ilvl w:val="1"/>
+          <w:numId w:val="1"/>
+        </w:numPr>
+        <w:rPr>
+          <w:lang w:val="pt-PT"/>
+        </w:rPr>
+      </w:pPr>
+      <w:r>
+        <w:rPr>
+          <w:lang w:val="pt-PT"/>
+        </w:rPr>
+        <w:t>Então o sistema calcula salário base + subsídios - descontos para cada funcionário e gera os recibos</w:t>
+      </w:r>
+    </w:p>
+    <w:p>
+      <w:pPr>
+        <w:ind w:firstLine="0"/>
+        <w:rPr>
+          <w:lang w:val="pt-PT"/>
+        </w:rPr>
+      </w:pPr>
+    </w:p>
+    <w:p>
+      <w:r>
+        <w:rPr>
+          <w:b/>
+          <w:bCs/>
+          <w:lang w:val="pt-PT"/>
+        </w:rPr>
+        <w:t>US-</w:t>
+      </w:r>
+      <w:r>
+        <w:rPr>
+          <w:b/>
+          <w:bCs/>
+          <w:lang w:val="pt-PT"/>
+        </w:rPr>
+        <w:t>18</w:t>
+      </w:r>
+      <w:r>
+        <w:rPr>
+          <w:b/>
+          <w:bCs/>
+          <w:lang w:val="pt-PT"/>
+        </w:rPr>
+        <w:t xml:space="preserve"> - </w:t>
+      </w:r>
+      <w:r>
+        <w:t>Como director de RH, quero poder monitorar as faltas e presenças de todos os funcioario, para melhor processamento do salário.</w:t>
+      </w:r>
+    </w:p>
+    <w:p>
+      <w:pPr>
+        <w:pStyle w:val="ListParagraph"/>
+        <w:numPr>
+          <w:ilvl w:val="0"/>
+          <w:numId w:val="1"/>
+        </w:numPr>
+        <w:rPr>
+          <w:lang w:val="pt-PT"/>
+        </w:rPr>
+      </w:pPr>
+      <w:r>
+        <w:rPr>
+          <w:lang w:val="pt-PT"/>
+        </w:rPr>
+        <w:t>CRITÉRIO DE ACEITAÇÃO (ACCEPTANCE CRITERIA)</w:t>
+      </w:r>
+    </w:p>
+    <w:p>
+      <w:pPr>
+        <w:rPr>
+          <w:lang w:val="pt-PT"/>
+        </w:rPr>
+      </w:pPr>
+    </w:p>
+    <w:p>
+      <w:pPr>
+        <w:pStyle w:val="Heading1"/>
+        <w:rPr>
+          <w:lang w:val="pt-PT"/>
+        </w:rPr>
+      </w:pPr>
+      <w:r>
+        <w:rPr>
+          <w:lang w:val="pt-PT"/>
+        </w:rPr>
         <w:t>EQUIP</w:t>
       </w:r>
       <w:r>
@@ -290,26 +1796,352 @@
       </w:pPr>
       <w:r>
         <w:rPr>
+          <w:b/>
+          <w:bCs/>
+          <w:lang w:val="pt-PT"/>
+        </w:rPr>
+        <w:t>US-</w:t>
+      </w:r>
+      <w:r>
+        <w:rPr>
+          <w:b/>
+          <w:bCs/>
+          <w:lang w:val="pt-PT"/>
+        </w:rPr>
+        <w:t>1</w:t>
+      </w:r>
+      <w:r>
+        <w:rPr>
+          <w:b/>
+          <w:bCs/>
+          <w:lang w:val="pt-PT"/>
+        </w:rPr>
+        <w:t>9</w:t>
+      </w:r>
+      <w:r>
+        <w:rPr>
+          <w:b/>
+          <w:bCs/>
+          <w:lang w:val="pt-PT"/>
+        </w:rPr>
+        <w:t xml:space="preserve"> </w:t>
+      </w:r>
+      <w:r>
+        <w:rPr>
+          <w:b/>
+          <w:bCs/>
+          <w:lang w:val="pt-PT"/>
+        </w:rPr>
+        <w:t xml:space="preserve">- </w:t>
+      </w:r>
+      <w:r>
+        <w:rPr>
           <w:lang w:val="pt-PT"/>
         </w:rPr>
         <w:t>Como equipe comercial, quero registrar os clientes e contactos para acompanhar oportunidades</w:t>
       </w:r>
-    </w:p>
-    <w:p>
-      <w:pPr>
-        <w:rPr>
-          <w:lang w:val="pt-PT"/>
-        </w:rPr>
-      </w:pPr>
-      <w:r>
-        <w:rPr>
-          <w:lang w:val="pt-PT"/>
-        </w:rPr>
-        <w:t>Como equipes comercial, quero registrar negociações, para não perder vendas</w:t>
-      </w:r>
-    </w:p>
-    <w:p>
-      <w:pPr>
+      <w:r>
+        <w:rPr>
+          <w:lang w:val="pt-PT"/>
+        </w:rPr>
+        <w:t>.</w:t>
+      </w:r>
+    </w:p>
+    <w:p>
+      <w:pPr>
+        <w:pStyle w:val="ListParagraph"/>
+        <w:numPr>
+          <w:ilvl w:val="0"/>
+          <w:numId w:val="1"/>
+        </w:numPr>
+        <w:rPr>
+          <w:lang w:val="pt-PT"/>
+        </w:rPr>
+      </w:pPr>
+      <w:r>
+        <w:rPr>
+          <w:lang w:val="pt-PT"/>
+        </w:rPr>
+        <w:t>CRITÉRIO DE ACEITAÇÃO (ACCEPTANCE CRITERIA)</w:t>
+      </w:r>
+    </w:p>
+    <w:p>
+      <w:pPr>
+        <w:rPr>
+          <w:lang w:val="pt-PT"/>
+        </w:rPr>
+      </w:pPr>
+    </w:p>
+    <w:p>
+      <w:pPr>
+        <w:rPr>
+          <w:lang w:val="pt-PT"/>
+        </w:rPr>
+      </w:pPr>
+      <w:r>
+        <w:rPr>
+          <w:b/>
+          <w:bCs/>
+          <w:lang w:val="pt-PT"/>
+        </w:rPr>
+        <w:t>US-</w:t>
+      </w:r>
+      <w:r>
+        <w:rPr>
+          <w:b/>
+          <w:bCs/>
+          <w:lang w:val="pt-PT"/>
+        </w:rPr>
+        <w:t>20</w:t>
+      </w:r>
+      <w:r>
+        <w:rPr>
+          <w:b/>
+          <w:bCs/>
+          <w:lang w:val="pt-PT"/>
+        </w:rPr>
+        <w:t xml:space="preserve"> </w:t>
+      </w:r>
+      <w:r>
+        <w:rPr>
+          <w:b/>
+          <w:bCs/>
+          <w:lang w:val="pt-PT"/>
+        </w:rPr>
+        <w:t xml:space="preserve">- </w:t>
+      </w:r>
+      <w:r>
+        <w:rPr>
+          <w:lang w:val="pt-PT"/>
+        </w:rPr>
+        <w:t>Como equipe comercial, quero registrar negociações, para não perder vendas</w:t>
+      </w:r>
+      <w:r>
+        <w:rPr>
+          <w:lang w:val="pt-PT"/>
+        </w:rPr>
+        <w:t>.</w:t>
+      </w:r>
+    </w:p>
+    <w:p>
+      <w:pPr>
+        <w:pStyle w:val="ListParagraph"/>
+        <w:numPr>
+          <w:ilvl w:val="0"/>
+          <w:numId w:val="1"/>
+        </w:numPr>
+        <w:rPr>
+          <w:lang w:val="pt-PT"/>
+        </w:rPr>
+      </w:pPr>
+      <w:r>
+        <w:rPr>
+          <w:lang w:val="pt-PT"/>
+        </w:rPr>
+        <w:t>CRITÉRIO DE ACEITAÇÃO (ACCEPTANCE CRITERIA)</w:t>
+      </w:r>
+    </w:p>
+    <w:p>
+      <w:pPr>
+        <w:rPr>
+          <w:lang w:val="pt-PT"/>
+        </w:rPr>
+      </w:pPr>
+    </w:p>
+    <w:p>
+      <w:r>
+        <w:rPr>
+          <w:b/>
+          <w:bCs/>
+          <w:lang w:val="pt-PT"/>
+        </w:rPr>
+        <w:t>US-</w:t>
+      </w:r>
+      <w:r>
+        <w:rPr>
+          <w:b/>
+          <w:bCs/>
+          <w:lang w:val="pt-PT"/>
+        </w:rPr>
+        <w:t>21</w:t>
+      </w:r>
+      <w:r>
+        <w:rPr>
+          <w:b/>
+          <w:bCs/>
+          <w:lang w:val="pt-PT"/>
+        </w:rPr>
+        <w:t xml:space="preserve"> </w:t>
+      </w:r>
+      <w:r>
+        <w:rPr>
+          <w:b/>
+          <w:bCs/>
+          <w:lang w:val="pt-PT"/>
+        </w:rPr>
+        <w:t xml:space="preserve">- </w:t>
+      </w:r>
+      <w:r>
+        <w:t xml:space="preserve">Como </w:t>
+      </w:r>
+      <w:r>
+        <w:t xml:space="preserve">equipe </w:t>
+      </w:r>
+      <w:r>
+        <w:t>comercial, quero criar um orçamento com produtos do catálogo e convertê-lo em factura com um clique, para eliminar erros de facturação manual</w:t>
+      </w:r>
+      <w:r>
+        <w:t>.</w:t>
+      </w:r>
+    </w:p>
+    <w:p>
+      <w:pPr>
+        <w:pStyle w:val="ListParagraph"/>
+        <w:numPr>
+          <w:ilvl w:val="0"/>
+          <w:numId w:val="1"/>
+        </w:numPr>
+        <w:rPr>
+          <w:lang w:val="pt-PT"/>
+        </w:rPr>
+      </w:pPr>
+      <w:r>
+        <w:rPr>
+          <w:lang w:val="pt-PT"/>
+        </w:rPr>
+        <w:t>CRITÉRIO DE ACEITAÇÃO (ACCEPTANCE CRITERIA)</w:t>
+      </w:r>
+    </w:p>
+    <w:p>
+      <w:pPr>
+        <w:rPr>
+          <w:lang w:val="pt-PT"/>
+        </w:rPr>
+      </w:pPr>
+    </w:p>
+    <w:p>
+      <w:r>
+        <w:rPr>
+          <w:b/>
+          <w:bCs/>
+          <w:lang w:val="pt-PT"/>
+        </w:rPr>
+        <w:t>US-</w:t>
+      </w:r>
+      <w:r>
+        <w:rPr>
+          <w:b/>
+          <w:bCs/>
+          <w:lang w:val="pt-PT"/>
+        </w:rPr>
+        <w:t>22</w:t>
+      </w:r>
+      <w:r>
+        <w:rPr>
+          <w:b/>
+          <w:bCs/>
+          <w:lang w:val="pt-PT"/>
+        </w:rPr>
+        <w:t xml:space="preserve"> </w:t>
+      </w:r>
+      <w:r>
+        <w:rPr>
+          <w:b/>
+          <w:bCs/>
+          <w:lang w:val="pt-PT"/>
+        </w:rPr>
+        <w:t xml:space="preserve">- </w:t>
+      </w:r>
+      <w:r>
+        <w:t>Como equipe comercial, quero ver o historicos de cada proposta e seu estado para monitorar o fluxo de pedidos dos clientes</w:t>
+      </w:r>
+      <w:r>
+        <w:t>.</w:t>
+      </w:r>
+    </w:p>
+    <w:p>
+      <w:pPr>
+        <w:pStyle w:val="ListParagraph"/>
+        <w:numPr>
+          <w:ilvl w:val="0"/>
+          <w:numId w:val="1"/>
+        </w:numPr>
+        <w:rPr>
+          <w:lang w:val="pt-PT"/>
+        </w:rPr>
+      </w:pPr>
+      <w:r>
+        <w:rPr>
+          <w:lang w:val="pt-PT"/>
+        </w:rPr>
+        <w:t>CRITÉRIO DE ACEITAÇÃO (ACCEPTANCE CRITERIA)</w:t>
+      </w:r>
+    </w:p>
+    <w:p>
+      <w:pPr>
+        <w:pStyle w:val="ListParagraph"/>
+        <w:numPr>
+          <w:ilvl w:val="1"/>
+          <w:numId w:val="1"/>
+        </w:numPr>
+        <w:rPr>
+          <w:lang w:val="pt-PT"/>
+        </w:rPr>
+      </w:pPr>
+      <w:r>
+        <w:rPr>
+          <w:lang w:val="pt-PT"/>
+        </w:rPr>
+        <w:lastRenderedPageBreak/>
+        <w:t>Dado que existe um cliente registado e produtos no catálogo com preços</w:t>
+      </w:r>
+    </w:p>
+    <w:p>
+      <w:pPr>
+        <w:pStyle w:val="ListParagraph"/>
+        <w:numPr>
+          <w:ilvl w:val="1"/>
+          <w:numId w:val="1"/>
+        </w:numPr>
+        <w:rPr>
+          <w:lang w:val="pt-PT"/>
+        </w:rPr>
+      </w:pPr>
+      <w:r>
+        <w:rPr>
+          <w:lang w:val="pt-PT"/>
+        </w:rPr>
+        <w:t>Quando crio uma ordem e selecciono os produtos e quantidades</w:t>
+      </w:r>
+    </w:p>
+    <w:p>
+      <w:pPr>
+        <w:pStyle w:val="ListParagraph"/>
+        <w:numPr>
+          <w:ilvl w:val="1"/>
+          <w:numId w:val="1"/>
+        </w:numPr>
+        <w:rPr>
+          <w:lang w:val="pt-PT"/>
+        </w:rPr>
+      </w:pPr>
+      <w:r>
+        <w:rPr>
+          <w:lang w:val="pt-PT"/>
+        </w:rPr>
+        <w:t>Então o sistema calcula o total, gera a factura em pdf e baixa o stock automaticamente</w:t>
+      </w:r>
+    </w:p>
+    <w:p>
+      <w:pPr>
+        <w:rPr>
+          <w:lang w:val="pt-PT"/>
+        </w:rPr>
+      </w:pPr>
+    </w:p>
+    <w:p>
+      <w:pPr>
+        <w:pStyle w:val="Heading1"/>
         <w:rPr>
           <w:lang w:val="pt-PT"/>
         </w:rPr>
@@ -329,23 +2161,156 @@
       </w:pPr>
       <w:r>
         <w:rPr>
+          <w:b/>
+          <w:bCs/>
+          <w:lang w:val="pt-PT"/>
+        </w:rPr>
+        <w:t>US-</w:t>
+      </w:r>
+      <w:r>
+        <w:rPr>
+          <w:b/>
+          <w:bCs/>
+          <w:lang w:val="pt-PT"/>
+        </w:rPr>
+        <w:t>23</w:t>
+      </w:r>
+      <w:r>
+        <w:rPr>
+          <w:b/>
+          <w:bCs/>
+          <w:lang w:val="pt-PT"/>
+        </w:rPr>
+        <w:t xml:space="preserve"> </w:t>
+      </w:r>
+      <w:r>
+        <w:rPr>
+          <w:b/>
+          <w:bCs/>
+          <w:lang w:val="pt-PT"/>
+        </w:rPr>
+        <w:t xml:space="preserve">- </w:t>
+      </w:r>
+      <w:r>
+        <w:rPr>
           <w:lang w:val="pt-PT"/>
         </w:rPr>
         <w:t>Como vendedor quero registrar as vendas realizadas para manter historicos</w:t>
       </w:r>
-    </w:p>
-    <w:p>
-      <w:pPr>
-        <w:rPr>
-          <w:lang w:val="pt-PT"/>
-        </w:rPr>
-      </w:pPr>
+      <w:r>
+        <w:rPr>
+          <w:lang w:val="pt-PT"/>
+        </w:rPr>
+        <w:t>.</w:t>
+      </w:r>
+    </w:p>
+    <w:p>
+      <w:pPr>
+        <w:pStyle w:val="ListParagraph"/>
+        <w:numPr>
+          <w:ilvl w:val="0"/>
+          <w:numId w:val="1"/>
+        </w:numPr>
+        <w:rPr>
+          <w:lang w:val="pt-PT"/>
+        </w:rPr>
+      </w:pPr>
+      <w:r>
+        <w:rPr>
+          <w:lang w:val="pt-PT"/>
+        </w:rPr>
+        <w:t>CRITÉRIO DE ACEITAÇÃO (ACCEPTANCE CRITERIA)</w:t>
+      </w:r>
+    </w:p>
+    <w:p>
+      <w:pPr>
+        <w:rPr>
+          <w:lang w:val="pt-PT"/>
+        </w:rPr>
+      </w:pPr>
+    </w:p>
+    <w:p>
+      <w:pPr>
+        <w:rPr>
+          <w:lang w:val="pt-PT"/>
+        </w:rPr>
+      </w:pPr>
+      <w:r>
+        <w:rPr>
+          <w:b/>
+          <w:bCs/>
+          <w:lang w:val="pt-PT"/>
+        </w:rPr>
+        <w:t>US-</w:t>
+      </w:r>
+      <w:r>
+        <w:rPr>
+          <w:b/>
+          <w:bCs/>
+          <w:lang w:val="pt-PT"/>
+        </w:rPr>
+        <w:t>24</w:t>
+      </w:r>
+      <w:r>
+        <w:rPr>
+          <w:b/>
+          <w:bCs/>
+          <w:lang w:val="pt-PT"/>
+        </w:rPr>
+        <w:t xml:space="preserve"> </w:t>
+      </w:r>
+      <w:r>
+        <w:rPr>
+          <w:b/>
+          <w:bCs/>
+          <w:lang w:val="pt-PT"/>
+        </w:rPr>
+        <w:t xml:space="preserve">- </w:t>
+      </w:r>
       <w:r>
         <w:rPr>
           <w:lang w:val="pt-PT"/>
         </w:rPr>
         <w:t>Como vendedor quero validar estoque antes de vender para evitar erros</w:t>
       </w:r>
+      <w:r>
+        <w:rPr>
+          <w:lang w:val="pt-PT"/>
+        </w:rPr>
+        <w:t>.</w:t>
+      </w:r>
+    </w:p>
+    <w:p>
+      <w:pPr>
+        <w:pStyle w:val="ListParagraph"/>
+        <w:numPr>
+          <w:ilvl w:val="0"/>
+          <w:numId w:val="1"/>
+        </w:numPr>
+        <w:rPr>
+          <w:lang w:val="pt-PT"/>
+        </w:rPr>
+      </w:pPr>
+      <w:r>
+        <w:rPr>
+          <w:lang w:val="pt-PT"/>
+        </w:rPr>
+        <w:t>CRITÉRIO DE ACEITAÇÃO (ACCEPTANCE CRITERIA)</w:t>
+      </w:r>
+    </w:p>
+    <w:p>
+      <w:pPr>
+        <w:rPr>
+          <w:lang w:val="pt-PT"/>
+        </w:rPr>
+      </w:pPr>
+    </w:p>
+    <w:p>
+      <w:pPr>
+        <w:rPr>
+          <w:lang w:val="pt-PT"/>
+        </w:rPr>
+      </w:pPr>
     </w:p>
     <w:sectPr>
       <w:pgSz w:w="11906" w:h="16838"/>
@@ -355,6 +2320,104 @@
     </w:sectPr>
   </w:body>
 </w:document>
+</file>
+
+<file path=word/numbering.xml><?xml version="1.0" encoding="utf-8"?>
+<w:numbering xmlns:wpc="http://schemas.microsoft.com/office/word/2010/wordprocessingCanvas" xmlns:cx="http://schemas.microsoft.com/office/drawing/2014/chartex" xmlns:cx1="http://schemas.microsoft.com/office/drawing/2015/9/8/chartex" xmlns:cx2="http://schemas.microsoft.com/office/drawing/2015/10/21/chartex" xmlns:cx3="http://schemas.microsoft.com/office/drawing/2016/5/9/chartex" xmlns:cx4="http://schemas.microsoft.com/office/drawing/2016/5/10/chartex" xmlns:cx5="http://schemas.microsoft.com/office/drawing/2016/5/11/chartex" xmlns:cx6="http://schemas.microsoft.com/office/drawing/2016/5/12/chartex" xmlns:cx7="http://schemas.microsoft.com/office/drawing/2016/5/13/chartex" xmlns:cx8="http://schemas.microsoft.com/office/drawing/2016/5/14/chartex" xmlns:mc="http://schemas.openxmlformats.org/markup-compatibility/2006" xmlns:aink="http://schemas.microsoft.com/office/drawing/2016/ink" xmlns:am3d="http://schemas.microsoft.com/office/drawing/2017/model3d" xmlns:o="urn:schemas-microsoft-com:office:office" xmlns:oel="http://schemas.microsoft.com/office/2019/extlst" xmlns:r="http://schemas.openxmlformats.org/officeDocument/2006/relationships" xmlns:m="http://schemas.openxmlformats.org/officeDocument/2006/math" xmlns:v="urn:schemas-microsoft-com:vml" xmlns:wp14="http://schemas.microsoft.com/office/word/2010/wordprocessingDrawing" xmlns:wp="http://schemas.openxmlformats.org/drawingml/2006/wordprocessingDrawing" xmlns:w10="urn:schemas-microsoft-com:office:word" xmlns:w="http://schemas.openxmlformats.org/wordprocessingml/2006/main" xmlns:w14="http://schemas.microsoft.com/office/word/2010/wordml" xmlns:w15="http://schemas.microsoft.com/office/word/2012/wordml" xmlns:w16cex="http://schemas.microsoft.com/office/word/2018/wordml/cex" xmlns:w16cid="http://schemas.microsoft.com/office/word/2016/wordml/cid" xmlns:w16="http://schemas.microsoft.com/office/word/2018/wordml" xmlns:w16du="http://schemas.microsoft.com/office/word/2023/wordml/word16du" xmlns:w16sdtdh="http://schemas.microsoft.com/office/word/2020/wordml/sdtdatahash" xmlns:w16sdtfl="http://schemas.microsoft.com/office/word/2024/wordml/sdtformatlock" xmlns:w16se="http://schemas.microsoft.com/office/word/2015/wordml/symex" xmlns:wpg="http://schemas.microsoft.com/office/word/2010/wordprocessingGroup" xmlns:wpi="http://schemas.microsoft.com/office/word/2010/wordprocessingInk" xmlns:wne="http://schemas.microsoft.com/office/word/2006/wordml" xmlns:wps="http://schemas.microsoft.com/office/word/2010/wordprocessingShape" mc:Ignorable="w14 w15 w16se w16cid w16 w16cex w16sdtdh w16sdtfl w16du wp14">
+  <w:abstractNum w:abstractNumId="0" w15:restartNumberingAfterBreak="0">
+    <w:nsid w:val="508D0599"/>
+    <w:multiLevelType w:val="hybridMultilevel"/>
+    <w:tmpl w:val="9D069B9A"/>
+    <w:lvl w:ilvl="0" w:tplc="0C00000F">
+      <w:start w:val="1"/>
+      <w:numFmt w:val="decimal"/>
+      <w:lvlText w:val="%1."/>
+      <w:lvlJc w:val="left"/>
+      <w:pPr>
+        <w:ind w:left="1004" w:hanging="360"/>
+      </w:pPr>
+    </w:lvl>
+    <w:lvl w:ilvl="1" w:tplc="9A123CBC">
+      <w:start w:val="1"/>
+      <w:numFmt w:val="bullet"/>
+      <w:lvlText w:val=""/>
+      <w:lvlJc w:val="left"/>
+      <w:pPr>
+        <w:ind w:left="1724" w:hanging="360"/>
+      </w:pPr>
+      <w:rPr>
+        <w:rFonts w:ascii="Wingdings" w:hAnsi="Wingdings" w:hint="default"/>
+        <w:color w:val="00B0F0"/>
+      </w:rPr>
+    </w:lvl>
+    <w:lvl w:ilvl="2" w:tplc="0C00001B" w:tentative="1">
+      <w:start w:val="1"/>
+      <w:numFmt w:val="lowerRoman"/>
+      <w:lvlText w:val="%3."/>
+      <w:lvlJc w:val="right"/>
+      <w:pPr>
+        <w:ind w:left="2444" w:hanging="180"/>
+      </w:pPr>
+    </w:lvl>
+    <w:lvl w:ilvl="3" w:tplc="0C00000F" w:tentative="1">
+      <w:start w:val="1"/>
+      <w:numFmt w:val="decimal"/>
+      <w:lvlText w:val="%4."/>
+      <w:lvlJc w:val="left"/>
+      <w:pPr>
+        <w:ind w:left="3164" w:hanging="360"/>
+      </w:pPr>
+    </w:lvl>
+    <w:lvl w:ilvl="4" w:tplc="0C000019" w:tentative="1">
+      <w:start w:val="1"/>
+      <w:numFmt w:val="lowerLetter"/>
+      <w:lvlText w:val="%5."/>
+      <w:lvlJc w:val="left"/>
+      <w:pPr>
+        <w:ind w:left="3884" w:hanging="360"/>
+      </w:pPr>
+    </w:lvl>
+    <w:lvl w:ilvl="5" w:tplc="0C00001B" w:tentative="1">
+      <w:start w:val="1"/>
+      <w:numFmt w:val="lowerRoman"/>
+      <w:lvlText w:val="%6."/>
+      <w:lvlJc w:val="right"/>
+      <w:pPr>
+        <w:ind w:left="4604" w:hanging="180"/>
+      </w:pPr>
+    </w:lvl>
+    <w:lvl w:ilvl="6" w:tplc="0C00000F" w:tentative="1">
+      <w:start w:val="1"/>
+      <w:numFmt w:val="decimal"/>
+      <w:lvlText w:val="%7."/>
+      <w:lvlJc w:val="left"/>
+      <w:pPr>
+        <w:ind w:left="5324" w:hanging="360"/>
+      </w:pPr>
+    </w:lvl>
+    <w:lvl w:ilvl="7" w:tplc="0C000019" w:tentative="1">
+      <w:start w:val="1"/>
+      <w:numFmt w:val="lowerLetter"/>
+      <w:lvlText w:val="%8."/>
+      <w:lvlJc w:val="left"/>
+      <w:pPr>
+        <w:ind w:left="6044" w:hanging="360"/>
+      </w:pPr>
+    </w:lvl>
+    <w:lvl w:ilvl="8" w:tplc="0C00001B" w:tentative="1">
+      <w:start w:val="1"/>
+      <w:numFmt w:val="lowerRoman"/>
+      <w:lvlText w:val="%9."/>
+      <w:lvlJc w:val="right"/>
+      <w:pPr>
+        <w:ind w:left="6764" w:hanging="180"/>
+      </w:pPr>
+    </w:lvl>
+  </w:abstractNum>
+  <w:num w:numId="1" w16cid:durableId="1276329959">
+    <w:abstractNumId w:val="0"/>
+  </w:num>
+</w:numbering>
 </file>
 
 <file path=word/styles.xml><?xml version="1.0" encoding="utf-8"?>
@@ -757,6 +2820,10 @@
   <w:style w:type="paragraph" w:default="1" w:styleId="Normal">
     <w:name w:val="Normal"/>
     <w:qFormat/>
+    <w:rsid w:val="0078437F"/>
+    <w:pPr>
+      <w:ind w:firstLine="284"/>
+    </w:pPr>
   </w:style>
   <w:style w:type="paragraph" w:styleId="Heading1">
     <w:name w:val="heading 1"/>
@@ -765,7 +2832,7 @@
     <w:link w:val="Heading1Char"/>
     <w:uiPriority w:val="9"/>
     <w:qFormat/>
-    <w:rsid w:val="00DE6B2B"/>
+    <w:rsid w:val="00510F11"/>
     <w:pPr>
       <w:keepNext/>
       <w:keepLines/>
@@ -774,8 +2841,9 @@
     </w:pPr>
     <w:rPr>
       <w:rFonts w:asciiTheme="majorHAnsi" w:eastAsiaTheme="majorEastAsia" w:hAnsiTheme="majorHAnsi" w:cstheme="majorBidi"/>
-      <w:color w:val="0F4761" w:themeColor="accent1" w:themeShade="BF"/>
-      <w:sz w:val="40"/>
+      <w:b/>
+      <w:color w:val="000000" w:themeColor="text1"/>
+      <w:sz w:val="28"/>
       <w:szCs w:val="40"/>
     </w:rPr>
   </w:style>
@@ -960,7 +3028,6 @@
   <w:style w:type="character" w:default="1" w:styleId="DefaultParagraphFont">
     <w:name w:val="Default Paragraph Font"/>
     <w:uiPriority w:val="1"/>
-    <w:semiHidden/>
     <w:unhideWhenUsed/>
   </w:style>
   <w:style w:type="table" w:default="1" w:styleId="TableNormal">
@@ -989,11 +3056,12 @@
     <w:basedOn w:val="DefaultParagraphFont"/>
     <w:link w:val="Heading1"/>
     <w:uiPriority w:val="9"/>
-    <w:rsid w:val="00DE6B2B"/>
+    <w:rsid w:val="00510F11"/>
     <w:rPr>
       <w:rFonts w:asciiTheme="majorHAnsi" w:eastAsiaTheme="majorEastAsia" w:hAnsiTheme="majorHAnsi" w:cstheme="majorBidi"/>
-      <w:color w:val="0F4761" w:themeColor="accent1" w:themeShade="BF"/>
-      <w:sz w:val="40"/>
+      <w:b/>
+      <w:color w:val="000000" w:themeColor="text1"/>
+      <w:sz w:val="28"/>
       <w:szCs w:val="40"/>
     </w:rPr>
   </w:style>
@@ -1149,6 +3217,7 @@
       <w:numPr>
         <w:ilvl w:val="1"/>
       </w:numPr>
+      <w:ind w:firstLine="284"/>
     </w:pPr>
     <w:rPr>
       <w:rFonts w:eastAsiaTheme="majorEastAsia" w:cstheme="majorBidi"/>

</xml_diff>